<commit_message>
Alterados modelos e criação de script para substituição dos modelos dos documentos em português de portugal
</commit_message>
<xml_diff>
--- a/translate-pt/2-docker/helper/pt/1.docx
+++ b/translate-pt/2-docker/helper/pt/1.docx
@@ -1,6 +1,6 @@
 
 <file path=word/document.xml><?xml version="1.0" encoding="utf-8"?>
-<w:document xmlns:wpc="http://schemas.microsoft.com/office/word/2010/wordprocessingCanvas" xmlns:cx="http://schemas.microsoft.com/office/drawing/2014/chartex" xmlns:cx1="http://schemas.microsoft.com/office/drawing/2015/9/8/chartex" xmlns:cx2="http://schemas.microsoft.com/office/drawing/2015/10/21/chartex" xmlns:cx3="http://schemas.microsoft.com/office/drawing/2016/5/9/chartex" xmlns:cx4="http://schemas.microsoft.com/office/drawing/2016/5/10/chartex" xmlns:cx5="http://schemas.microsoft.com/office/drawing/2016/5/11/chartex" xmlns:cx6="http://schemas.microsoft.com/office/drawing/2016/5/12/chartex" xmlns:cx7="http://schemas.microsoft.com/office/drawing/2016/5/13/chartex" xmlns:cx8="http://schemas.microsoft.com/office/drawing/2016/5/14/chartex" xmlns:mc="http://schemas.openxmlformats.org/markup-compatibility/2006" xmlns:aink="http://schemas.microsoft.com/office/drawing/2016/ink" xmlns:am3d="http://schemas.microsoft.com/office/drawing/2017/model3d" xmlns:o="urn:schemas-microsoft-com:office:office" xmlns:oel="http://schemas.microsoft.com/office/2019/extlst" xmlns:r="http://schemas.openxmlformats.org/officeDocument/2006/relationships" xmlns:m="http://schemas.openxmlformats.org/officeDocument/2006/math" xmlns:v="urn:schemas-microsoft-com:vml" xmlns:wp14="http://schemas.microsoft.com/office/word/2010/wordprocessingDrawing" xmlns:wp="http://schemas.openxmlformats.org/drawingml/2006/wordprocessingDrawing" xmlns:w10="urn:schemas-microsoft-com:office:word" xmlns:w="http://schemas.openxmlformats.org/wordprocessingml/2006/main" xmlns:w14="http://schemas.microsoft.com/office/word/2010/wordml" xmlns:w15="http://schemas.microsoft.com/office/word/2012/wordml" xmlns:w16cex="http://schemas.microsoft.com/office/word/2018/wordml/cex" xmlns:w16cid="http://schemas.microsoft.com/office/word/2016/wordml/cid" xmlns:w16="http://schemas.microsoft.com/office/word/2018/wordml" xmlns:w16sdtdh="http://schemas.microsoft.com/office/word/2020/wordml/sdtdatahash" xmlns:w16se="http://schemas.microsoft.com/office/word/2015/wordml/symex" xmlns:wpg="http://schemas.microsoft.com/office/word/2010/wordprocessingGroup" xmlns:wpi="http://schemas.microsoft.com/office/word/2010/wordprocessingInk" xmlns:wne="http://schemas.microsoft.com/office/word/2006/wordml" xmlns:wps="http://schemas.microsoft.com/office/word/2010/wordprocessingShape" mc:Ignorable="w14 w15 w16se w16cid w16 w16cex w16sdtdh wp14">
+<w:document xmlns:wpc="http://schemas.microsoft.com/office/word/2010/wordprocessingCanvas" xmlns:cx="http://schemas.microsoft.com/office/drawing/2014/chartex" xmlns:cx1="http://schemas.microsoft.com/office/drawing/2015/9/8/chartex" xmlns:cx2="http://schemas.microsoft.com/office/drawing/2015/10/21/chartex" xmlns:cx3="http://schemas.microsoft.com/office/drawing/2016/5/9/chartex" xmlns:cx4="http://schemas.microsoft.com/office/drawing/2016/5/10/chartex" xmlns:cx5="http://schemas.microsoft.com/office/drawing/2016/5/11/chartex" xmlns:cx6="http://schemas.microsoft.com/office/drawing/2016/5/12/chartex" xmlns:cx7="http://schemas.microsoft.com/office/drawing/2016/5/13/chartex" xmlns:cx8="http://schemas.microsoft.com/office/drawing/2016/5/14/chartex" xmlns:mc="http://schemas.openxmlformats.org/markup-compatibility/2006" xmlns:aink="http://schemas.microsoft.com/office/drawing/2016/ink" xmlns:am3d="http://schemas.microsoft.com/office/drawing/2017/model3d" xmlns:o="urn:schemas-microsoft-com:office:office" xmlns:oel="http://schemas.microsoft.com/office/2019/extlst" xmlns:r="http://schemas.openxmlformats.org/officeDocument/2006/relationships" xmlns:m="http://schemas.openxmlformats.org/officeDocument/2006/math" xmlns:v="urn:schemas-microsoft-com:vml" xmlns:wp14="http://schemas.microsoft.com/office/word/2010/wordprocessingDrawing" xmlns:wp="http://schemas.openxmlformats.org/drawingml/2006/wordprocessingDrawing" xmlns:w10="urn:schemas-microsoft-com:office:word" xmlns:w="http://schemas.openxmlformats.org/wordprocessingml/2006/main" xmlns:w14="http://schemas.microsoft.com/office/word/2010/wordml" xmlns:w15="http://schemas.microsoft.com/office/word/2012/wordml" xmlns:w16cex="http://schemas.microsoft.com/office/word/2018/wordml/cex" xmlns:w16cid="http://schemas.microsoft.com/office/word/2016/wordml/cid" xmlns:w16="http://schemas.microsoft.com/office/word/2018/wordml" xmlns:w16du="http://schemas.microsoft.com/office/word/2023/wordml/word16du" xmlns:w16sdtdh="http://schemas.microsoft.com/office/word/2020/wordml/sdtdatahash" xmlns:w16sdtfl="http://schemas.microsoft.com/office/word/2024/wordml/sdtformatlock" xmlns:w16se="http://schemas.microsoft.com/office/word/2015/wordml/symex" xmlns:wpg="http://schemas.microsoft.com/office/word/2010/wordprocessingGroup" xmlns:wpi="http://schemas.microsoft.com/office/word/2010/wordprocessingInk" xmlns:wne="http://schemas.microsoft.com/office/word/2006/wordml" xmlns:wps="http://schemas.microsoft.com/office/word/2010/wordprocessingShape" mc:Ignorable="w14 w15 w16se w16cid w16 w16cex w16sdtdh w16sdtfl w16du wp14">
   <w:body>
     <w:p>
       <w:pPr>
@@ -18,7 +18,7 @@
           <w:lang w:eastAsia="en-US"/>
         </w:rPr>
         <w:drawing>
-          <wp:anchor distT="0" distB="0" distL="114300" distR="114300" simplePos="0" relativeHeight="251661312" behindDoc="0" locked="0" layoutInCell="1" allowOverlap="1" wp14:anchorId="491FDEFA" wp14:editId="6B433A7F">
+          <wp:anchor distT="0" distB="0" distL="114300" distR="114300" simplePos="0" relativeHeight="251661312" behindDoc="0" locked="0" layoutInCell="1" allowOverlap="1" wp14:anchorId="491FDEFA" wp14:editId="668AD092">
             <wp:simplePos x="0" y="0"/>
             <wp:positionH relativeFrom="column">
               <wp:posOffset>-29210</wp:posOffset>
@@ -802,9 +802,11 @@
               <w:b w:val="0"/>
               <w:bCs w:val="0"/>
               <w:caps w:val="0"/>
-              <w:sz w:val="22"/>
-              <w:szCs w:val="22"/>
-              <w:lang w:eastAsia="en-US"/>
+              <w:kern w:val="2"/>
+              <w:sz w:val="24"/>
+              <w:szCs w:val="24"/>
+              <w:lang w:eastAsia="pt-PT"/>
+              <w14:ligatures w14:val="standardContextual"/>
             </w:rPr>
           </w:pPr>
           <w:r>
@@ -825,13 +827,13 @@
             </w:rPr>
             <w:fldChar w:fldCharType="separate"/>
           </w:r>
-          <w:hyperlink w:anchor="_Toc75419076" w:history="1">
+          <w:hyperlink w:anchor="_Toc190687213" w:history="1">
             <w:r>
               <w:rPr>
                 <w:rStyle w:val="Hiperligao"/>
                 <w:lang w:val="fr-LU"/>
               </w:rPr>
-              <w:t>1</w:t>
+              <w:t>1.</w:t>
             </w:r>
             <w:r>
               <w:rPr>
@@ -839,18 +841,19 @@
                 <w:b w:val="0"/>
                 <w:bCs w:val="0"/>
                 <w:caps w:val="0"/>
-                <w:sz w:val="22"/>
-                <w:szCs w:val="22"/>
-                <w:lang w:eastAsia="en-US"/>
+                <w:kern w:val="2"/>
+                <w:sz w:val="24"/>
+                <w:szCs w:val="24"/>
+                <w:lang w:eastAsia="pt-PT"/>
+                <w14:ligatures w14:val="standardContextual"/>
               </w:rPr>
               <w:tab/>
             </w:r>
             <w:r>
               <w:rPr>
                 <w:rStyle w:val="Hiperligao"/>
-                <w:lang w:val="fr-LU"/>
-              </w:rPr>
-              <w:t>Introduction</w:t>
+              </w:rPr>
+              <w:t>Introdução</w:t>
             </w:r>
             <w:r>
               <w:rPr>
@@ -868,7 +871,7 @@
               <w:rPr>
                 <w:webHidden/>
               </w:rPr>
-              <w:instrText xml:space="preserve"> PAGEREF _Toc75419076 \h </w:instrText>
+              <w:instrText xml:space="preserve"> PAGEREF _Toc190687213 \h </w:instrText>
             </w:r>
             <w:r>
               <w:rPr>
@@ -905,12 +908,14 @@
             <w:rPr>
               <w:rFonts w:asciiTheme="minorHAnsi" w:eastAsiaTheme="minorEastAsia" w:hAnsiTheme="minorHAnsi" w:cstheme="minorBidi"/>
               <w:smallCaps w:val="0"/>
-              <w:sz w:val="22"/>
-              <w:szCs w:val="22"/>
-              <w:lang w:eastAsia="en-US"/>
+              <w:kern w:val="2"/>
+              <w:sz w:val="24"/>
+              <w:szCs w:val="24"/>
+              <w:lang w:eastAsia="pt-PT"/>
+              <w14:ligatures w14:val="standardContextual"/>
             </w:rPr>
           </w:pPr>
-          <w:hyperlink w:anchor="_Toc75419077" w:history="1">
+          <w:hyperlink w:anchor="_Toc190687214" w:history="1">
             <w:r>
               <w:rPr>
                 <w:rStyle w:val="Hiperligao"/>
@@ -923,9 +928,11 @@
               <w:rPr>
                 <w:rFonts w:asciiTheme="minorHAnsi" w:eastAsiaTheme="minorEastAsia" w:hAnsiTheme="minorHAnsi" w:cstheme="minorBidi"/>
                 <w:smallCaps w:val="0"/>
-                <w:sz w:val="22"/>
-                <w:szCs w:val="22"/>
-                <w:lang w:eastAsia="en-US"/>
+                <w:kern w:val="2"/>
+                <w:sz w:val="24"/>
+                <w:szCs w:val="24"/>
+                <w:lang w:eastAsia="pt-PT"/>
+                <w14:ligatures w14:val="standardContextual"/>
               </w:rPr>
               <w:tab/>
             </w:r>
@@ -933,7 +940,7 @@
               <w:rPr>
                 <w:rStyle w:val="Hiperligao"/>
               </w:rPr>
-              <w:t>Placing the risk analysis in context</w:t>
+              <w:t>Contextualizar a análise de risco</w:t>
             </w:r>
             <w:r>
               <w:rPr>
@@ -951,7 +958,7 @@
               <w:rPr>
                 <w:webHidden/>
               </w:rPr>
-              <w:instrText xml:space="preserve"> PAGEREF _Toc75419077 \h </w:instrText>
+              <w:instrText xml:space="preserve"> PAGEREF _Toc190687214 \h </w:instrText>
             </w:r>
             <w:r>
               <w:rPr>
@@ -988,12 +995,14 @@
             <w:rPr>
               <w:rFonts w:asciiTheme="minorHAnsi" w:eastAsiaTheme="minorEastAsia" w:hAnsiTheme="minorHAnsi" w:cstheme="minorBidi"/>
               <w:smallCaps w:val="0"/>
-              <w:sz w:val="22"/>
-              <w:szCs w:val="22"/>
-              <w:lang w:eastAsia="en-US"/>
+              <w:kern w:val="2"/>
+              <w:sz w:val="24"/>
+              <w:szCs w:val="24"/>
+              <w:lang w:eastAsia="pt-PT"/>
+              <w14:ligatures w14:val="standardContextual"/>
             </w:rPr>
           </w:pPr>
-          <w:hyperlink w:anchor="_Toc75419078" w:history="1">
+          <w:hyperlink w:anchor="_Toc190687215" w:history="1">
             <w:r>
               <w:rPr>
                 <w:rStyle w:val="Hiperligao"/>
@@ -1006,9 +1015,11 @@
               <w:rPr>
                 <w:rFonts w:asciiTheme="minorHAnsi" w:eastAsiaTheme="minorEastAsia" w:hAnsiTheme="minorHAnsi" w:cstheme="minorBidi"/>
                 <w:smallCaps w:val="0"/>
-                <w:sz w:val="22"/>
-                <w:szCs w:val="22"/>
-                <w:lang w:eastAsia="en-US"/>
+                <w:kern w:val="2"/>
+                <w:sz w:val="24"/>
+                <w:szCs w:val="24"/>
+                <w:lang w:eastAsia="pt-PT"/>
+                <w14:ligatures w14:val="standardContextual"/>
               </w:rPr>
               <w:tab/>
             </w:r>
@@ -1016,7 +1027,7 @@
               <w:rPr>
                 <w:rStyle w:val="Hiperligao"/>
               </w:rPr>
-              <w:t>Aims of the document</w:t>
+              <w:t>Objetivos do documento</w:t>
             </w:r>
             <w:r>
               <w:rPr>
@@ -1034,7 +1045,7 @@
               <w:rPr>
                 <w:webHidden/>
               </w:rPr>
-              <w:instrText xml:space="preserve"> PAGEREF _Toc75419078 \h </w:instrText>
+              <w:instrText xml:space="preserve"> PAGEREF _Toc190687215 \h </w:instrText>
             </w:r>
             <w:r>
               <w:rPr>
@@ -1071,12 +1082,14 @@
             <w:rPr>
               <w:rFonts w:asciiTheme="minorHAnsi" w:eastAsiaTheme="minorEastAsia" w:hAnsiTheme="minorHAnsi" w:cstheme="minorBidi"/>
               <w:smallCaps w:val="0"/>
-              <w:sz w:val="22"/>
-              <w:szCs w:val="22"/>
-              <w:lang w:eastAsia="en-US"/>
+              <w:kern w:val="2"/>
+              <w:sz w:val="24"/>
+              <w:szCs w:val="24"/>
+              <w:lang w:eastAsia="pt-PT"/>
+              <w14:ligatures w14:val="standardContextual"/>
             </w:rPr>
           </w:pPr>
-          <w:hyperlink w:anchor="_Toc75419079" w:history="1">
+          <w:hyperlink w:anchor="_Toc190687216" w:history="1">
             <w:r>
               <w:rPr>
                 <w:rStyle w:val="Hiperligao"/>
@@ -1089,9 +1102,11 @@
               <w:rPr>
                 <w:rFonts w:asciiTheme="minorHAnsi" w:eastAsiaTheme="minorEastAsia" w:hAnsiTheme="minorHAnsi" w:cstheme="minorBidi"/>
                 <w:smallCaps w:val="0"/>
-                <w:sz w:val="22"/>
-                <w:szCs w:val="22"/>
-                <w:lang w:eastAsia="en-US"/>
+                <w:kern w:val="2"/>
+                <w:sz w:val="24"/>
+                <w:szCs w:val="24"/>
+                <w:lang w:eastAsia="pt-PT"/>
+                <w14:ligatures w14:val="standardContextual"/>
               </w:rPr>
               <w:tab/>
             </w:r>
@@ -1099,7 +1114,7 @@
               <w:rPr>
                 <w:rStyle w:val="Hiperligao"/>
               </w:rPr>
-              <w:t>Acronyms/Glossary</w:t>
+              <w:t>Acrónimos/Glossário</w:t>
             </w:r>
             <w:r>
               <w:rPr>
@@ -1117,7 +1132,7 @@
               <w:rPr>
                 <w:webHidden/>
               </w:rPr>
-              <w:instrText xml:space="preserve"> PAGEREF _Toc75419079 \h </w:instrText>
+              <w:instrText xml:space="preserve"> PAGEREF _Toc190687216 \h </w:instrText>
             </w:r>
             <w:r>
               <w:rPr>
@@ -1156,12 +1171,14 @@
               <w:b w:val="0"/>
               <w:bCs w:val="0"/>
               <w:caps w:val="0"/>
-              <w:sz w:val="22"/>
-              <w:szCs w:val="22"/>
-              <w:lang w:eastAsia="en-US"/>
+              <w:kern w:val="2"/>
+              <w:sz w:val="24"/>
+              <w:szCs w:val="24"/>
+              <w:lang w:eastAsia="pt-PT"/>
+              <w14:ligatures w14:val="standardContextual"/>
             </w:rPr>
           </w:pPr>
-          <w:hyperlink w:anchor="_Toc75419080" w:history="1">
+          <w:hyperlink w:anchor="_Toc190687217" w:history="1">
             <w:r>
               <w:rPr>
                 <w:rStyle w:val="Hiperligao"/>
@@ -1175,18 +1192,19 @@
                 <w:b w:val="0"/>
                 <w:bCs w:val="0"/>
                 <w:caps w:val="0"/>
-                <w:sz w:val="22"/>
-                <w:szCs w:val="22"/>
-                <w:lang w:eastAsia="en-US"/>
+                <w:kern w:val="2"/>
+                <w:sz w:val="24"/>
+                <w:szCs w:val="24"/>
+                <w:lang w:eastAsia="pt-PT"/>
+                <w14:ligatures w14:val="standardContextual"/>
               </w:rPr>
               <w:tab/>
             </w:r>
             <w:r>
               <w:rPr>
                 <w:rStyle w:val="Hiperligao"/>
-                <w:lang w:val="fr-LU"/>
-              </w:rPr>
-              <w:t>Context Establishment</w:t>
+              </w:rPr>
+              <w:t>Estabelecimento do Contexto</w:t>
             </w:r>
             <w:r>
               <w:rPr>
@@ -1204,7 +1222,7 @@
               <w:rPr>
                 <w:webHidden/>
               </w:rPr>
-              <w:instrText xml:space="preserve"> PAGEREF _Toc75419080 \h </w:instrText>
+              <w:instrText xml:space="preserve"> PAGEREF _Toc190687217 \h </w:instrText>
             </w:r>
             <w:r>
               <w:rPr>
@@ -1241,12 +1259,14 @@
             <w:rPr>
               <w:rFonts w:asciiTheme="minorHAnsi" w:eastAsiaTheme="minorEastAsia" w:hAnsiTheme="minorHAnsi" w:cstheme="minorBidi"/>
               <w:smallCaps w:val="0"/>
-              <w:sz w:val="22"/>
-              <w:szCs w:val="22"/>
-              <w:lang w:eastAsia="en-US"/>
+              <w:kern w:val="2"/>
+              <w:sz w:val="24"/>
+              <w:szCs w:val="24"/>
+              <w:lang w:eastAsia="pt-PT"/>
+              <w14:ligatures w14:val="standardContextual"/>
             </w:rPr>
           </w:pPr>
-          <w:hyperlink w:anchor="_Toc75419081" w:history="1">
+          <w:hyperlink w:anchor="_Toc190687218" w:history="1">
             <w:r>
               <w:rPr>
                 <w:rStyle w:val="Hiperligao"/>
@@ -1260,18 +1280,19 @@
               <w:rPr>
                 <w:rFonts w:asciiTheme="minorHAnsi" w:eastAsiaTheme="minorEastAsia" w:hAnsiTheme="minorHAnsi" w:cstheme="minorBidi"/>
                 <w:smallCaps w:val="0"/>
-                <w:sz w:val="22"/>
-                <w:szCs w:val="22"/>
-                <w:lang w:eastAsia="en-US"/>
+                <w:kern w:val="2"/>
+                <w:sz w:val="24"/>
+                <w:szCs w:val="24"/>
+                <w:lang w:eastAsia="pt-PT"/>
+                <w14:ligatures w14:val="standardContextual"/>
               </w:rPr>
               <w:tab/>
             </w:r>
             <w:r>
               <w:rPr>
                 <w:rStyle w:val="Hiperligao"/>
-                <w:lang w:val="fr-LU"/>
-              </w:rPr>
-              <w:t>Description of the context</w:t>
+              </w:rPr>
+              <w:t>Descrição do contexto</w:t>
             </w:r>
             <w:r>
               <w:rPr>
@@ -1289,7 +1310,7 @@
               <w:rPr>
                 <w:webHidden/>
               </w:rPr>
-              <w:instrText xml:space="preserve"> PAGEREF _Toc75419081 \h </w:instrText>
+              <w:instrText xml:space="preserve"> PAGEREF _Toc190687218 \h </w:instrText>
             </w:r>
             <w:r>
               <w:rPr>
@@ -1326,12 +1347,14 @@
             <w:rPr>
               <w:rFonts w:asciiTheme="minorHAnsi" w:eastAsiaTheme="minorEastAsia" w:hAnsiTheme="minorHAnsi" w:cstheme="minorBidi"/>
               <w:smallCaps w:val="0"/>
-              <w:sz w:val="22"/>
-              <w:szCs w:val="22"/>
-              <w:lang w:eastAsia="en-US"/>
+              <w:kern w:val="2"/>
+              <w:sz w:val="24"/>
+              <w:szCs w:val="24"/>
+              <w:lang w:eastAsia="pt-PT"/>
+              <w14:ligatures w14:val="standardContextual"/>
             </w:rPr>
           </w:pPr>
-          <w:hyperlink w:anchor="_Toc75419082" w:history="1">
+          <w:hyperlink w:anchor="_Toc190687219" w:history="1">
             <w:r>
               <w:rPr>
                 <w:rStyle w:val="Hiperligao"/>
@@ -1344,9 +1367,11 @@
               <w:rPr>
                 <w:rFonts w:asciiTheme="minorHAnsi" w:eastAsiaTheme="minorEastAsia" w:hAnsiTheme="minorHAnsi" w:cstheme="minorBidi"/>
                 <w:smallCaps w:val="0"/>
-                <w:sz w:val="22"/>
-                <w:szCs w:val="22"/>
-                <w:lang w:eastAsia="en-US"/>
+                <w:kern w:val="2"/>
+                <w:sz w:val="24"/>
+                <w:szCs w:val="24"/>
+                <w:lang w:eastAsia="pt-PT"/>
+                <w14:ligatures w14:val="standardContextual"/>
               </w:rPr>
               <w:tab/>
             </w:r>
@@ -1354,7 +1379,7 @@
               <w:rPr>
                 <w:rStyle w:val="Hiperligao"/>
               </w:rPr>
-              <w:t>Definition of the risk evaluation criteria</w:t>
+              <w:t>Definição dos critérios de avaliação dos riscos</w:t>
             </w:r>
             <w:r>
               <w:rPr>
@@ -1372,7 +1397,7 @@
               <w:rPr>
                 <w:webHidden/>
               </w:rPr>
-              <w:instrText xml:space="preserve"> PAGEREF _Toc75419082 \h </w:instrText>
+              <w:instrText xml:space="preserve"> PAGEREF _Toc190687219 \h </w:instrText>
             </w:r>
             <w:r>
               <w:rPr>
@@ -1410,15 +1435,18 @@
               <w:rFonts w:asciiTheme="minorHAnsi" w:eastAsiaTheme="minorEastAsia" w:hAnsiTheme="minorHAnsi" w:cstheme="minorBidi"/>
               <w:i w:val="0"/>
               <w:iCs w:val="0"/>
-              <w:sz w:val="22"/>
-              <w:szCs w:val="22"/>
-              <w:lang w:eastAsia="en-US"/>
+              <w:kern w:val="2"/>
+              <w:sz w:val="24"/>
+              <w:szCs w:val="24"/>
+              <w:lang w:eastAsia="pt-PT"/>
+              <w14:ligatures w14:val="standardContextual"/>
             </w:rPr>
           </w:pPr>
-          <w:hyperlink w:anchor="_Toc75419083" w:history="1">
+          <w:hyperlink w:anchor="_Toc190687220" w:history="1">
             <w:r>
               <w:rPr>
                 <w:rStyle w:val="Hiperligao"/>
+                <w:lang w:val="en-US"/>
               </w:rPr>
               <w:t>2.2.1</w:t>
             </w:r>
@@ -1427,9 +1455,11 @@
                 <w:rFonts w:asciiTheme="minorHAnsi" w:eastAsiaTheme="minorEastAsia" w:hAnsiTheme="minorHAnsi" w:cstheme="minorBidi"/>
                 <w:i w:val="0"/>
                 <w:iCs w:val="0"/>
-                <w:sz w:val="22"/>
-                <w:szCs w:val="22"/>
-                <w:lang w:eastAsia="en-US"/>
+                <w:kern w:val="2"/>
+                <w:sz w:val="24"/>
+                <w:szCs w:val="24"/>
+                <w:lang w:eastAsia="pt-PT"/>
+                <w14:ligatures w14:val="standardContextual"/>
               </w:rPr>
               <w:tab/>
             </w:r>
@@ -1437,7 +1467,7 @@
               <w:rPr>
                 <w:rStyle w:val="Hiperligao"/>
               </w:rPr>
-              <w:t>Information risks</w:t>
+              <w:t>Riscos da informação</w:t>
             </w:r>
             <w:r>
               <w:rPr>
@@ -1455,7 +1485,7 @@
               <w:rPr>
                 <w:webHidden/>
               </w:rPr>
-              <w:instrText xml:space="preserve"> PAGEREF _Toc75419083 \h </w:instrText>
+              <w:instrText xml:space="preserve"> PAGEREF _Toc190687220 \h </w:instrText>
             </w:r>
             <w:r>
               <w:rPr>
@@ -1493,12 +1523,14 @@
               <w:rFonts w:asciiTheme="minorHAnsi" w:eastAsiaTheme="minorEastAsia" w:hAnsiTheme="minorHAnsi" w:cstheme="minorBidi"/>
               <w:i w:val="0"/>
               <w:iCs w:val="0"/>
-              <w:sz w:val="22"/>
-              <w:szCs w:val="22"/>
-              <w:lang w:eastAsia="en-US"/>
+              <w:kern w:val="2"/>
+              <w:sz w:val="24"/>
+              <w:szCs w:val="24"/>
+              <w:lang w:eastAsia="pt-PT"/>
+              <w14:ligatures w14:val="standardContextual"/>
             </w:rPr>
           </w:pPr>
-          <w:hyperlink w:anchor="_Toc75419084" w:history="1">
+          <w:hyperlink w:anchor="_Toc190687221" w:history="1">
             <w:r>
               <w:rPr>
                 <w:rStyle w:val="Hiperligao"/>
@@ -1511,9 +1543,11 @@
                 <w:rFonts w:asciiTheme="minorHAnsi" w:eastAsiaTheme="minorEastAsia" w:hAnsiTheme="minorHAnsi" w:cstheme="minorBidi"/>
                 <w:i w:val="0"/>
                 <w:iCs w:val="0"/>
-                <w:sz w:val="22"/>
-                <w:szCs w:val="22"/>
-                <w:lang w:eastAsia="en-US"/>
+                <w:kern w:val="2"/>
+                <w:sz w:val="24"/>
+                <w:szCs w:val="24"/>
+                <w:lang w:eastAsia="pt-PT"/>
+                <w14:ligatures w14:val="standardContextual"/>
               </w:rPr>
               <w:tab/>
             </w:r>
@@ -1521,7 +1555,7 @@
               <w:rPr>
                 <w:rStyle w:val="Hiperligao"/>
               </w:rPr>
-              <w:t>Impact scale</w:t>
+              <w:t>Escala de impacto</w:t>
             </w:r>
             <w:r>
               <w:rPr>
@@ -1539,7 +1573,7 @@
               <w:rPr>
                 <w:webHidden/>
               </w:rPr>
-              <w:instrText xml:space="preserve"> PAGEREF _Toc75419084 \h </w:instrText>
+              <w:instrText xml:space="preserve"> PAGEREF _Toc190687221 \h </w:instrText>
             </w:r>
             <w:r>
               <w:rPr>
@@ -1577,12 +1611,14 @@
               <w:rFonts w:asciiTheme="minorHAnsi" w:eastAsiaTheme="minorEastAsia" w:hAnsiTheme="minorHAnsi" w:cstheme="minorBidi"/>
               <w:i w:val="0"/>
               <w:iCs w:val="0"/>
-              <w:sz w:val="22"/>
-              <w:szCs w:val="22"/>
-              <w:lang w:eastAsia="en-US"/>
+              <w:kern w:val="2"/>
+              <w:sz w:val="24"/>
+              <w:szCs w:val="24"/>
+              <w:lang w:eastAsia="pt-PT"/>
+              <w14:ligatures w14:val="standardContextual"/>
             </w:rPr>
           </w:pPr>
-          <w:hyperlink w:anchor="_Toc75419085" w:history="1">
+          <w:hyperlink w:anchor="_Toc190687222" w:history="1">
             <w:r>
               <w:rPr>
                 <w:rStyle w:val="Hiperligao"/>
@@ -1595,9 +1631,11 @@
                 <w:rFonts w:asciiTheme="minorHAnsi" w:eastAsiaTheme="minorEastAsia" w:hAnsiTheme="minorHAnsi" w:cstheme="minorBidi"/>
                 <w:i w:val="0"/>
                 <w:iCs w:val="0"/>
-                <w:sz w:val="22"/>
-                <w:szCs w:val="22"/>
-                <w:lang w:eastAsia="en-US"/>
+                <w:kern w:val="2"/>
+                <w:sz w:val="24"/>
+                <w:szCs w:val="24"/>
+                <w:lang w:eastAsia="pt-PT"/>
+                <w14:ligatures w14:val="standardContextual"/>
               </w:rPr>
               <w:tab/>
             </w:r>
@@ -1605,7 +1643,7 @@
               <w:rPr>
                 <w:rStyle w:val="Hiperligao"/>
               </w:rPr>
-              <w:t>Threat scale</w:t>
+              <w:t>Escala de ameaças</w:t>
             </w:r>
             <w:r>
               <w:rPr>
@@ -1623,7 +1661,7 @@
               <w:rPr>
                 <w:webHidden/>
               </w:rPr>
-              <w:instrText xml:space="preserve"> PAGEREF _Toc75419085 \h </w:instrText>
+              <w:instrText xml:space="preserve"> PAGEREF _Toc190687222 \h </w:instrText>
             </w:r>
             <w:r>
               <w:rPr>
@@ -1661,12 +1699,14 @@
               <w:rFonts w:asciiTheme="minorHAnsi" w:eastAsiaTheme="minorEastAsia" w:hAnsiTheme="minorHAnsi" w:cstheme="minorBidi"/>
               <w:i w:val="0"/>
               <w:iCs w:val="0"/>
-              <w:sz w:val="22"/>
-              <w:szCs w:val="22"/>
-              <w:lang w:eastAsia="en-US"/>
+              <w:kern w:val="2"/>
+              <w:sz w:val="24"/>
+              <w:szCs w:val="24"/>
+              <w:lang w:eastAsia="pt-PT"/>
+              <w14:ligatures w14:val="standardContextual"/>
             </w:rPr>
           </w:pPr>
-          <w:hyperlink w:anchor="_Toc75419086" w:history="1">
+          <w:hyperlink w:anchor="_Toc190687223" w:history="1">
             <w:r>
               <w:rPr>
                 <w:rStyle w:val="Hiperligao"/>
@@ -1679,9 +1719,11 @@
                 <w:rFonts w:asciiTheme="minorHAnsi" w:eastAsiaTheme="minorEastAsia" w:hAnsiTheme="minorHAnsi" w:cstheme="minorBidi"/>
                 <w:i w:val="0"/>
                 <w:iCs w:val="0"/>
-                <w:sz w:val="22"/>
-                <w:szCs w:val="22"/>
-                <w:lang w:eastAsia="en-US"/>
+                <w:kern w:val="2"/>
+                <w:sz w:val="24"/>
+                <w:szCs w:val="24"/>
+                <w:lang w:eastAsia="pt-PT"/>
+                <w14:ligatures w14:val="standardContextual"/>
               </w:rPr>
               <w:tab/>
             </w:r>
@@ -1689,7 +1731,7 @@
               <w:rPr>
                 <w:rStyle w:val="Hiperligao"/>
               </w:rPr>
-              <w:t>Vulnerability scale</w:t>
+              <w:t>Escala de vulnerabilidade</w:t>
             </w:r>
             <w:r>
               <w:rPr>
@@ -1707,7 +1749,7 @@
               <w:rPr>
                 <w:webHidden/>
               </w:rPr>
-              <w:instrText xml:space="preserve"> PAGEREF _Toc75419086 \h </w:instrText>
+              <w:instrText xml:space="preserve"> PAGEREF _Toc190687223 \h </w:instrText>
             </w:r>
             <w:r>
               <w:rPr>
@@ -1745,12 +1787,14 @@
               <w:rFonts w:asciiTheme="minorHAnsi" w:eastAsiaTheme="minorEastAsia" w:hAnsiTheme="minorHAnsi" w:cstheme="minorBidi"/>
               <w:i w:val="0"/>
               <w:iCs w:val="0"/>
-              <w:sz w:val="22"/>
-              <w:szCs w:val="22"/>
-              <w:lang w:eastAsia="en-US"/>
+              <w:kern w:val="2"/>
+              <w:sz w:val="24"/>
+              <w:szCs w:val="24"/>
+              <w:lang w:eastAsia="pt-PT"/>
+              <w14:ligatures w14:val="standardContextual"/>
             </w:rPr>
           </w:pPr>
-          <w:hyperlink w:anchor="_Toc75419087" w:history="1">
+          <w:hyperlink w:anchor="_Toc190687224" w:history="1">
             <w:r>
               <w:rPr>
                 <w:rStyle w:val="Hiperligao"/>
@@ -1763,9 +1807,11 @@
                 <w:rFonts w:asciiTheme="minorHAnsi" w:eastAsiaTheme="minorEastAsia" w:hAnsiTheme="minorHAnsi" w:cstheme="minorBidi"/>
                 <w:i w:val="0"/>
                 <w:iCs w:val="0"/>
-                <w:sz w:val="22"/>
-                <w:szCs w:val="22"/>
-                <w:lang w:eastAsia="en-US"/>
+                <w:kern w:val="2"/>
+                <w:sz w:val="24"/>
+                <w:szCs w:val="24"/>
+                <w:lang w:eastAsia="pt-PT"/>
+                <w14:ligatures w14:val="standardContextual"/>
               </w:rPr>
               <w:tab/>
             </w:r>
@@ -1773,7 +1819,7 @@
               <w:rPr>
                 <w:rStyle w:val="Hiperligao"/>
               </w:rPr>
-              <w:t>Risk acceptance thresholds</w:t>
+              <w:t>Limiares de aceitação do risco</w:t>
             </w:r>
             <w:r>
               <w:rPr>
@@ -1791,7 +1837,7 @@
               <w:rPr>
                 <w:webHidden/>
               </w:rPr>
-              <w:instrText xml:space="preserve"> PAGEREF _Toc75419087 \h </w:instrText>
+              <w:instrText xml:space="preserve"> PAGEREF _Toc190687224 \h </w:instrText>
             </w:r>
             <w:r>
               <w:rPr>
@@ -1829,15 +1875,18 @@
               <w:rFonts w:asciiTheme="minorHAnsi" w:eastAsiaTheme="minorEastAsia" w:hAnsiTheme="minorHAnsi" w:cstheme="minorBidi"/>
               <w:i w:val="0"/>
               <w:iCs w:val="0"/>
-              <w:sz w:val="22"/>
-              <w:szCs w:val="22"/>
-              <w:lang w:eastAsia="en-US"/>
+              <w:kern w:val="2"/>
+              <w:sz w:val="24"/>
+              <w:szCs w:val="24"/>
+              <w:lang w:eastAsia="pt-PT"/>
+              <w14:ligatures w14:val="standardContextual"/>
             </w:rPr>
           </w:pPr>
-          <w:hyperlink w:anchor="_Toc75419088" w:history="1">
+          <w:hyperlink w:anchor="_Toc190687225" w:history="1">
             <w:r>
               <w:rPr>
                 <w:rStyle w:val="Hiperligao"/>
+                <w:lang w:val="en-US"/>
               </w:rPr>
               <w:t>2.2.2</w:t>
             </w:r>
@@ -1846,9 +1895,11 @@
                 <w:rFonts w:asciiTheme="minorHAnsi" w:eastAsiaTheme="minorEastAsia" w:hAnsiTheme="minorHAnsi" w:cstheme="minorBidi"/>
                 <w:i w:val="0"/>
                 <w:iCs w:val="0"/>
-                <w:sz w:val="22"/>
-                <w:szCs w:val="22"/>
-                <w:lang w:eastAsia="en-US"/>
+                <w:kern w:val="2"/>
+                <w:sz w:val="24"/>
+                <w:szCs w:val="24"/>
+                <w:lang w:eastAsia="pt-PT"/>
+                <w14:ligatures w14:val="standardContextual"/>
               </w:rPr>
               <w:tab/>
             </w:r>
@@ -1856,7 +1907,7 @@
               <w:rPr>
                 <w:rStyle w:val="Hiperligao"/>
               </w:rPr>
-              <w:t>Operational risks</w:t>
+              <w:t>Riscos operacionais</w:t>
             </w:r>
             <w:r>
               <w:rPr>
@@ -1874,7 +1925,7 @@
               <w:rPr>
                 <w:webHidden/>
               </w:rPr>
-              <w:instrText xml:space="preserve"> PAGEREF _Toc75419088 \h </w:instrText>
+              <w:instrText xml:space="preserve"> PAGEREF _Toc190687225 \h </w:instrText>
             </w:r>
             <w:r>
               <w:rPr>
@@ -1912,12 +1963,14 @@
               <w:rFonts w:asciiTheme="minorHAnsi" w:eastAsiaTheme="minorEastAsia" w:hAnsiTheme="minorHAnsi" w:cstheme="minorBidi"/>
               <w:i w:val="0"/>
               <w:iCs w:val="0"/>
-              <w:sz w:val="22"/>
-              <w:szCs w:val="22"/>
-              <w:lang w:eastAsia="en-US"/>
+              <w:kern w:val="2"/>
+              <w:sz w:val="24"/>
+              <w:szCs w:val="24"/>
+              <w:lang w:eastAsia="pt-PT"/>
+              <w14:ligatures w14:val="standardContextual"/>
             </w:rPr>
           </w:pPr>
-          <w:hyperlink w:anchor="_Toc75419089" w:history="1">
+          <w:hyperlink w:anchor="_Toc190687226" w:history="1">
             <w:r>
               <w:rPr>
                 <w:rStyle w:val="Hiperligao"/>
@@ -1930,9 +1983,11 @@
                 <w:rFonts w:asciiTheme="minorHAnsi" w:eastAsiaTheme="minorEastAsia" w:hAnsiTheme="minorHAnsi" w:cstheme="minorBidi"/>
                 <w:i w:val="0"/>
                 <w:iCs w:val="0"/>
-                <w:sz w:val="22"/>
-                <w:szCs w:val="22"/>
-                <w:lang w:eastAsia="en-US"/>
+                <w:kern w:val="2"/>
+                <w:sz w:val="24"/>
+                <w:szCs w:val="24"/>
+                <w:lang w:eastAsia="pt-PT"/>
+                <w14:ligatures w14:val="standardContextual"/>
               </w:rPr>
               <w:tab/>
             </w:r>
@@ -1940,7 +1995,7 @@
               <w:rPr>
                 <w:rStyle w:val="Hiperligao"/>
               </w:rPr>
-              <w:t>Impact scale</w:t>
+              <w:t>Escala de impacto</w:t>
             </w:r>
             <w:r>
               <w:rPr>
@@ -1958,7 +2013,7 @@
               <w:rPr>
                 <w:webHidden/>
               </w:rPr>
-              <w:instrText xml:space="preserve"> PAGEREF _Toc75419089 \h </w:instrText>
+              <w:instrText xml:space="preserve"> PAGEREF _Toc190687226 \h </w:instrText>
             </w:r>
             <w:r>
               <w:rPr>
@@ -1996,12 +2051,14 @@
               <w:rFonts w:asciiTheme="minorHAnsi" w:eastAsiaTheme="minorEastAsia" w:hAnsiTheme="minorHAnsi" w:cstheme="minorBidi"/>
               <w:i w:val="0"/>
               <w:iCs w:val="0"/>
-              <w:sz w:val="22"/>
-              <w:szCs w:val="22"/>
-              <w:lang w:eastAsia="en-US"/>
+              <w:kern w:val="2"/>
+              <w:sz w:val="24"/>
+              <w:szCs w:val="24"/>
+              <w:lang w:eastAsia="pt-PT"/>
+              <w14:ligatures w14:val="standardContextual"/>
             </w:rPr>
           </w:pPr>
-          <w:hyperlink w:anchor="_Toc75419090" w:history="1">
+          <w:hyperlink w:anchor="_Toc190687227" w:history="1">
             <w:r>
               <w:rPr>
                 <w:rStyle w:val="Hiperligao"/>
@@ -2014,9 +2071,11 @@
                 <w:rFonts w:asciiTheme="minorHAnsi" w:eastAsiaTheme="minorEastAsia" w:hAnsiTheme="minorHAnsi" w:cstheme="minorBidi"/>
                 <w:i w:val="0"/>
                 <w:iCs w:val="0"/>
-                <w:sz w:val="22"/>
-                <w:szCs w:val="22"/>
-                <w:lang w:eastAsia="en-US"/>
+                <w:kern w:val="2"/>
+                <w:sz w:val="24"/>
+                <w:szCs w:val="24"/>
+                <w:lang w:eastAsia="pt-PT"/>
+                <w14:ligatures w14:val="standardContextual"/>
               </w:rPr>
               <w:tab/>
             </w:r>
@@ -2024,7 +2083,7 @@
               <w:rPr>
                 <w:rStyle w:val="Hiperligao"/>
               </w:rPr>
-              <w:t>Likelihood scale</w:t>
+              <w:t>Escala de probabilidade</w:t>
             </w:r>
             <w:r>
               <w:rPr>
@@ -2042,7 +2101,7 @@
               <w:rPr>
                 <w:webHidden/>
               </w:rPr>
-              <w:instrText xml:space="preserve"> PAGEREF _Toc75419090 \h </w:instrText>
+              <w:instrText xml:space="preserve"> PAGEREF _Toc190687227 \h </w:instrText>
             </w:r>
             <w:r>
               <w:rPr>
@@ -2080,12 +2139,14 @@
               <w:rFonts w:asciiTheme="minorHAnsi" w:eastAsiaTheme="minorEastAsia" w:hAnsiTheme="minorHAnsi" w:cstheme="minorBidi"/>
               <w:i w:val="0"/>
               <w:iCs w:val="0"/>
-              <w:sz w:val="22"/>
-              <w:szCs w:val="22"/>
-              <w:lang w:eastAsia="en-US"/>
+              <w:kern w:val="2"/>
+              <w:sz w:val="24"/>
+              <w:szCs w:val="24"/>
+              <w:lang w:eastAsia="pt-PT"/>
+              <w14:ligatures w14:val="standardContextual"/>
             </w:rPr>
           </w:pPr>
-          <w:hyperlink w:anchor="_Toc75419091" w:history="1">
+          <w:hyperlink w:anchor="_Toc190687228" w:history="1">
             <w:r>
               <w:rPr>
                 <w:rStyle w:val="Hiperligao"/>
@@ -2098,9 +2159,11 @@
                 <w:rFonts w:asciiTheme="minorHAnsi" w:eastAsiaTheme="minorEastAsia" w:hAnsiTheme="minorHAnsi" w:cstheme="minorBidi"/>
                 <w:i w:val="0"/>
                 <w:iCs w:val="0"/>
-                <w:sz w:val="22"/>
-                <w:szCs w:val="22"/>
-                <w:lang w:eastAsia="en-US"/>
+                <w:kern w:val="2"/>
+                <w:sz w:val="24"/>
+                <w:szCs w:val="24"/>
+                <w:lang w:eastAsia="pt-PT"/>
+                <w14:ligatures w14:val="standardContextual"/>
               </w:rPr>
               <w:tab/>
             </w:r>
@@ -2108,7 +2171,7 @@
               <w:rPr>
                 <w:rStyle w:val="Hiperligao"/>
               </w:rPr>
-              <w:t>Risk acceptance thresholds</w:t>
+              <w:t>Limiares de aceitação do risco</w:t>
             </w:r>
             <w:r>
               <w:rPr>
@@ -2126,7 +2189,7 @@
               <w:rPr>
                 <w:webHidden/>
               </w:rPr>
-              <w:instrText xml:space="preserve"> PAGEREF _Toc75419091 \h </w:instrText>
+              <w:instrText xml:space="preserve"> PAGEREF _Toc190687228 \h </w:instrText>
             </w:r>
             <w:r>
               <w:rPr>
@@ -2163,12 +2226,14 @@
             <w:rPr>
               <w:rFonts w:asciiTheme="minorHAnsi" w:eastAsiaTheme="minorEastAsia" w:hAnsiTheme="minorHAnsi" w:cstheme="minorBidi"/>
               <w:smallCaps w:val="0"/>
-              <w:sz w:val="22"/>
-              <w:szCs w:val="22"/>
-              <w:lang w:eastAsia="en-US"/>
+              <w:kern w:val="2"/>
+              <w:sz w:val="24"/>
+              <w:szCs w:val="24"/>
+              <w:lang w:eastAsia="pt-PT"/>
+              <w14:ligatures w14:val="standardContextual"/>
             </w:rPr>
           </w:pPr>
-          <w:hyperlink w:anchor="_Toc75419092" w:history="1">
+          <w:hyperlink w:anchor="_Toc190687229" w:history="1">
             <w:r>
               <w:rPr>
                 <w:rStyle w:val="Hiperligao"/>
@@ -2181,9 +2246,11 @@
               <w:rPr>
                 <w:rFonts w:asciiTheme="minorHAnsi" w:eastAsiaTheme="minorEastAsia" w:hAnsiTheme="minorHAnsi" w:cstheme="minorBidi"/>
                 <w:smallCaps w:val="0"/>
-                <w:sz w:val="22"/>
-                <w:szCs w:val="22"/>
-                <w:lang w:eastAsia="en-US"/>
+                <w:kern w:val="2"/>
+                <w:sz w:val="24"/>
+                <w:szCs w:val="24"/>
+                <w:lang w:eastAsia="pt-PT"/>
+                <w14:ligatures w14:val="standardContextual"/>
               </w:rPr>
               <w:tab/>
             </w:r>
@@ -2191,7 +2258,7 @@
               <w:rPr>
                 <w:rStyle w:val="Hiperligao"/>
               </w:rPr>
-              <w:t>Evaluation of trends and threats</w:t>
+              <w:t>Avaliação de tendências e ameaças</w:t>
             </w:r>
             <w:r>
               <w:rPr>
@@ -2209,7 +2276,7 @@
               <w:rPr>
                 <w:webHidden/>
               </w:rPr>
-              <w:instrText xml:space="preserve"> PAGEREF _Toc75419092 \h </w:instrText>
+              <w:instrText xml:space="preserve"> PAGEREF _Toc190687229 \h </w:instrText>
             </w:r>
             <w:r>
               <w:rPr>
@@ -2247,17 +2314,19 @@
               <w:b w:val="0"/>
               <w:bCs w:val="0"/>
               <w:caps w:val="0"/>
-              <w:sz w:val="22"/>
-              <w:szCs w:val="22"/>
-              <w:lang w:eastAsia="en-US"/>
+              <w:kern w:val="2"/>
+              <w:sz w:val="24"/>
+              <w:szCs w:val="24"/>
+              <w:lang w:eastAsia="pt-PT"/>
+              <w14:ligatures w14:val="standardContextual"/>
             </w:rPr>
           </w:pPr>
-          <w:hyperlink w:anchor="_Toc75419093" w:history="1">
+          <w:hyperlink w:anchor="_Toc190687230" w:history="1">
             <w:r>
               <w:rPr>
                 <w:rStyle w:val="Hiperligao"/>
               </w:rPr>
-              <w:t>Appendix A: Interview and information collection</w:t>
+              <w:t>Apêndice A: Entrevista e recolha de informação</w:t>
             </w:r>
             <w:r>
               <w:rPr>
@@ -2275,7 +2344,7 @@
               <w:rPr>
                 <w:webHidden/>
               </w:rPr>
-              <w:instrText xml:space="preserve"> PAGEREF _Toc75419093 \h </w:instrText>
+              <w:instrText xml:space="preserve"> PAGEREF _Toc190687230 \h </w:instrText>
             </w:r>
             <w:r>
               <w:rPr>
@@ -2313,17 +2382,19 @@
               <w:b w:val="0"/>
               <w:bCs w:val="0"/>
               <w:caps w:val="0"/>
-              <w:sz w:val="22"/>
-              <w:szCs w:val="22"/>
-              <w:lang w:eastAsia="en-US"/>
+              <w:kern w:val="2"/>
+              <w:sz w:val="24"/>
+              <w:szCs w:val="24"/>
+              <w:lang w:eastAsia="pt-PT"/>
+              <w14:ligatures w14:val="standardContextual"/>
             </w:rPr>
           </w:pPr>
-          <w:hyperlink w:anchor="_Toc75419094" w:history="1">
+          <w:hyperlink w:anchor="_Toc190687231" w:history="1">
             <w:r>
               <w:rPr>
                 <w:rStyle w:val="Hiperligao"/>
               </w:rPr>
-              <w:t>Appendix B: Evaluation of trends</w:t>
+              <w:t>Apêndice B: Avaliação das tendências</w:t>
             </w:r>
             <w:r>
               <w:rPr>
@@ -2341,7 +2412,7 @@
               <w:rPr>
                 <w:webHidden/>
               </w:rPr>
-              <w:instrText xml:space="preserve"> PAGEREF _Toc75419094 \h </w:instrText>
+              <w:instrText xml:space="preserve"> PAGEREF _Toc190687231 \h </w:instrText>
             </w:r>
             <w:r>
               <w:rPr>
@@ -2379,17 +2450,19 @@
               <w:b w:val="0"/>
               <w:bCs w:val="0"/>
               <w:caps w:val="0"/>
-              <w:sz w:val="22"/>
-              <w:szCs w:val="22"/>
-              <w:lang w:eastAsia="en-US"/>
+              <w:kern w:val="2"/>
+              <w:sz w:val="24"/>
+              <w:szCs w:val="24"/>
+              <w:lang w:eastAsia="pt-PT"/>
+              <w14:ligatures w14:val="standardContextual"/>
             </w:rPr>
           </w:pPr>
-          <w:hyperlink w:anchor="_Toc75419095" w:history="1">
+          <w:hyperlink w:anchor="_Toc190687232" w:history="1">
             <w:r>
               <w:rPr>
                 <w:rStyle w:val="Hiperligao"/>
               </w:rPr>
-              <w:t>Appendix C: Evaluation of threats</w:t>
+              <w:t>Apêndice C: Avaliação das ameaças</w:t>
             </w:r>
             <w:r>
               <w:rPr>
@@ -2407,7 +2480,7 @@
               <w:rPr>
                 <w:webHidden/>
               </w:rPr>
-              <w:instrText xml:space="preserve"> PAGEREF _Toc75419095 \h </w:instrText>
+              <w:instrText xml:space="preserve"> PAGEREF _Toc190687232 \h </w:instrText>
             </w:r>
             <w:r>
               <w:rPr>
@@ -2609,16 +2682,13 @@
         </w:rPr>
       </w:pPr>
       <w:bookmarkStart w:id="8" w:name="_Toc475524845"/>
-      <w:bookmarkStart w:id="9" w:name="_Toc75419077"/>
-      <w:bookmarkStart w:id="10" w:name="_Toc75419076"/>
+      <w:bookmarkStart w:id="9" w:name="_Toc190687213"/>
       <w:r>
         <w:lastRenderedPageBreak/>
         <w:t>Introdução</w:t>
       </w:r>
-      <w:bookmarkEnd w:id="10"/>
-    </w:p>
-    <w:bookmarkEnd w:id="8"/>
-    <w:bookmarkEnd w:id="9"/>
+      <w:bookmarkEnd w:id="9"/>
+    </w:p>
     <w:p>
       <w:pPr>
         <w:pStyle w:val="Ttulo2"/>
@@ -2627,9 +2697,12 @@
           <w:numId w:val="1"/>
         </w:numPr>
       </w:pPr>
+      <w:bookmarkStart w:id="10" w:name="_Toc190687214"/>
+      <w:bookmarkEnd w:id="8"/>
       <w:r>
         <w:t>Contextualizar a análise de risco</w:t>
       </w:r>
+      <w:bookmarkEnd w:id="10"/>
     </w:p>
     <w:p>
       <w:pPr>
@@ -2653,7 +2726,7 @@
         <w:spacing w:before="0"/>
       </w:pPr>
       <w:bookmarkStart w:id="11" w:name="_Toc475524846"/>
-      <w:bookmarkStart w:id="12" w:name="_Toc75419078"/>
+      <w:bookmarkStart w:id="12" w:name="_Toc190687215"/>
       <w:r>
         <w:t>Objetivos do documento</w:t>
       </w:r>
@@ -2682,7 +2755,7 @@
         </w:numPr>
       </w:pPr>
       <w:bookmarkStart w:id="13" w:name="_Toc475524848"/>
-      <w:bookmarkStart w:id="14" w:name="_Toc75419079"/>
+      <w:bookmarkStart w:id="14" w:name="_Toc190687216"/>
       <w:r>
         <w:t>Acrónimos/Glossário</w:t>
       </w:r>
@@ -2759,14 +2832,14 @@
           <w:lang w:val="fr-LU"/>
         </w:rPr>
       </w:pPr>
-      <w:bookmarkStart w:id="15" w:name="_Toc354489473"/>
-      <w:bookmarkStart w:id="16" w:name="_Toc475524850"/>
-      <w:bookmarkStart w:id="17" w:name="_Toc75419080"/>
+      <w:bookmarkStart w:id="15" w:name="_Toc475524850"/>
+      <w:bookmarkStart w:id="16" w:name="_Toc354489473"/>
+      <w:bookmarkStart w:id="17" w:name="_Toc190687217"/>
       <w:r>
         <w:lastRenderedPageBreak/>
         <w:t>Estabelecimento do Contexto</w:t>
       </w:r>
-      <w:bookmarkEnd w:id="16"/>
+      <w:bookmarkEnd w:id="15"/>
       <w:bookmarkEnd w:id="17"/>
     </w:p>
     <w:p>
@@ -2782,14 +2855,14 @@
         </w:rPr>
       </w:pPr>
       <w:bookmarkStart w:id="18" w:name="_Toc475524851"/>
-      <w:bookmarkStart w:id="19" w:name="_Toc75419081"/>
+      <w:bookmarkStart w:id="19" w:name="_Toc190687218"/>
       <w:r>
         <w:t>Descrição do contexto</w:t>
       </w:r>
       <w:bookmarkEnd w:id="18"/>
       <w:bookmarkEnd w:id="19"/>
     </w:p>
-    <w:bookmarkEnd w:id="15"/>
+    <w:bookmarkEnd w:id="16"/>
     <w:p>
       <w:pPr>
         <w:rPr>
@@ -2810,15 +2883,15 @@
         </w:numPr>
         <w:spacing w:before="0"/>
       </w:pPr>
-      <w:bookmarkStart w:id="20" w:name="_Toc354489475"/>
-      <w:bookmarkStart w:id="21" w:name="_Toc354489474"/>
-      <w:bookmarkStart w:id="22" w:name="_Toc475524852"/>
-      <w:bookmarkStart w:id="23" w:name="_Toc75419082"/>
+      <w:bookmarkStart w:id="20" w:name="_Toc354489474"/>
+      <w:bookmarkStart w:id="21" w:name="_Toc475524852"/>
+      <w:bookmarkStart w:id="22" w:name="_Toc354489475"/>
+      <w:bookmarkStart w:id="23" w:name="_Toc190687219"/>
       <w:r>
         <w:t>Definição dos critérios de avaliação dos riscos</w:t>
       </w:r>
+      <w:bookmarkEnd w:id="20"/>
       <w:bookmarkEnd w:id="21"/>
-      <w:bookmarkEnd w:id="22"/>
       <w:bookmarkEnd w:id="23"/>
     </w:p>
     <w:p>
@@ -2830,7 +2903,7 @@
         </w:numPr>
         <w:ind w:left="709"/>
       </w:pPr>
-      <w:bookmarkStart w:id="24" w:name="_Toc75419083"/>
+      <w:bookmarkStart w:id="24" w:name="_Toc190687220"/>
       <w:r>
         <w:t>Riscos da informação</w:t>
       </w:r>
@@ -2848,8 +2921,8 @@
         </w:rPr>
       </w:pPr>
       <w:bookmarkStart w:id="25" w:name="_Toc475524853"/>
-      <w:bookmarkStart w:id="26" w:name="_Toc75419084"/>
-      <w:bookmarkEnd w:id="20"/>
+      <w:bookmarkStart w:id="26" w:name="_Toc190687221"/>
+      <w:bookmarkEnd w:id="22"/>
       <w:r>
         <w:t>Escala de impacto</w:t>
       </w:r>
@@ -2886,7 +2959,7 @@
         </w:rPr>
       </w:pPr>
       <w:bookmarkStart w:id="27" w:name="_Toc475524854"/>
-      <w:bookmarkStart w:id="28" w:name="_Toc75419085"/>
+      <w:bookmarkStart w:id="28" w:name="_Toc190687222"/>
       <w:r>
         <w:t>Escala de ameaças</w:t>
       </w:r>
@@ -2935,7 +3008,7 @@
         </w:rPr>
       </w:pPr>
       <w:bookmarkStart w:id="29" w:name="_Toc475524855"/>
-      <w:bookmarkStart w:id="30" w:name="_Toc75419086"/>
+      <w:bookmarkStart w:id="30" w:name="_Toc190687223"/>
       <w:r>
         <w:t>Escala de vulnerabilidade</w:t>
       </w:r>
@@ -2999,7 +3072,7 @@
         </w:numPr>
       </w:pPr>
       <w:bookmarkStart w:id="31" w:name="_Toc475524856"/>
-      <w:bookmarkStart w:id="32" w:name="_Toc75419087"/>
+      <w:bookmarkStart w:id="32" w:name="_Toc190687224"/>
       <w:r>
         <w:lastRenderedPageBreak/>
         <w:t>Limiares de aceitação do risco</w:t>
@@ -3119,7 +3192,7 @@
         </w:numPr>
         <w:ind w:left="709"/>
       </w:pPr>
-      <w:bookmarkStart w:id="33" w:name="_Toc75419088"/>
+      <w:bookmarkStart w:id="33" w:name="_Toc190687225"/>
       <w:r>
         <w:t>Riscos operacionais</w:t>
       </w:r>
@@ -3133,7 +3206,7 @@
           <w:numId w:val="1"/>
         </w:numPr>
       </w:pPr>
-      <w:bookmarkStart w:id="34" w:name="_Toc75419089"/>
+      <w:bookmarkStart w:id="34" w:name="_Toc190687226"/>
       <w:r>
         <w:t>Escala de impacto</w:t>
       </w:r>
@@ -3152,14 +3225,14 @@
           <w:numId w:val="1"/>
         </w:numPr>
       </w:pPr>
-      <w:bookmarkStart w:id="35" w:name="_Toc75419090"/>
+      <w:bookmarkStart w:id="35" w:name="_Toc190687227"/>
       <w:r>
         <w:t xml:space="preserve">Escala de </w:t>
       </w:r>
+      <w:r>
+        <w:t>probabilidade</w:t>
+      </w:r>
       <w:bookmarkEnd w:id="35"/>
-      <w:r>
-        <w:t>probabilidade</w:t>
-      </w:r>
     </w:p>
     <w:p>
       <w:r>
@@ -3174,7 +3247,7 @@
           <w:numId w:val="1"/>
         </w:numPr>
       </w:pPr>
-      <w:bookmarkStart w:id="36" w:name="_Toc75419091"/>
+      <w:bookmarkStart w:id="36" w:name="_Toc190687228"/>
       <w:r>
         <w:t>Limiares de aceitação do risco</w:t>
       </w:r>
@@ -3203,7 +3276,7 @@
         </w:numPr>
       </w:pPr>
       <w:bookmarkStart w:id="37" w:name="_Toc475524857"/>
-      <w:bookmarkStart w:id="38" w:name="_Toc75419092"/>
+      <w:bookmarkStart w:id="38" w:name="_Toc190687229"/>
       <w:r>
         <w:t>Avaliação de tendências e ameaças</w:t>
       </w:r>
@@ -3254,7 +3327,7 @@
         <w:pStyle w:val="Ttulo1"/>
       </w:pPr>
       <w:bookmarkStart w:id="39" w:name="_Toc475524862"/>
-      <w:bookmarkStart w:id="40" w:name="_Toc75419093"/>
+      <w:bookmarkStart w:id="40" w:name="_Toc190687230"/>
       <w:r>
         <w:lastRenderedPageBreak/>
         <w:t>Apêndice A: Entrevista e recolha de informação</w:t>
@@ -3283,7 +3356,7 @@
         <w:pStyle w:val="Ttulo1"/>
       </w:pPr>
       <w:bookmarkStart w:id="41" w:name="_Toc475524863"/>
-      <w:bookmarkStart w:id="42" w:name="_Toc75419094"/>
+      <w:bookmarkStart w:id="42" w:name="_Toc190687231"/>
       <w:r>
         <w:lastRenderedPageBreak/>
         <w:t>Apêndice B: Avaliação das tendências</w:t>
@@ -3309,7 +3382,7 @@
         <w:pStyle w:val="Ttulo1"/>
       </w:pPr>
       <w:bookmarkStart w:id="43" w:name="_Toc475524864"/>
-      <w:bookmarkStart w:id="44" w:name="_Toc75419095"/>
+      <w:bookmarkStart w:id="44" w:name="_Toc190687232"/>
       <w:r>
         <w:lastRenderedPageBreak/>
         <w:t>Apêndice C: Avaliação das ameaças</w:t>
@@ -3347,7 +3420,7 @@
 </file>
 
 <file path=word/endnotes.xml><?xml version="1.0" encoding="utf-8"?>
-<w:endnotes xmlns:wpc="http://schemas.microsoft.com/office/word/2010/wordprocessingCanvas" xmlns:cx="http://schemas.microsoft.com/office/drawing/2014/chartex" xmlns:cx1="http://schemas.microsoft.com/office/drawing/2015/9/8/chartex" xmlns:cx2="http://schemas.microsoft.com/office/drawing/2015/10/21/chartex" xmlns:cx3="http://schemas.microsoft.com/office/drawing/2016/5/9/chartex" xmlns:cx4="http://schemas.microsoft.com/office/drawing/2016/5/10/chartex" xmlns:cx5="http://schemas.microsoft.com/office/drawing/2016/5/11/chartex" xmlns:cx6="http://schemas.microsoft.com/office/drawing/2016/5/12/chartex" xmlns:cx7="http://schemas.microsoft.com/office/drawing/2016/5/13/chartex" xmlns:cx8="http://schemas.microsoft.com/office/drawing/2016/5/14/chartex" xmlns:mc="http://schemas.openxmlformats.org/markup-compatibility/2006" xmlns:aink="http://schemas.microsoft.com/office/drawing/2016/ink" xmlns:am3d="http://schemas.microsoft.com/office/drawing/2017/model3d" xmlns:o="urn:schemas-microsoft-com:office:office" xmlns:oel="http://schemas.microsoft.com/office/2019/extlst" xmlns:r="http://schemas.openxmlformats.org/officeDocument/2006/relationships" xmlns:m="http://schemas.openxmlformats.org/officeDocument/2006/math" xmlns:v="urn:schemas-microsoft-com:vml" xmlns:wp14="http://schemas.microsoft.com/office/word/2010/wordprocessingDrawing" xmlns:wp="http://schemas.openxmlformats.org/drawingml/2006/wordprocessingDrawing" xmlns:w10="urn:schemas-microsoft-com:office:word" xmlns:w="http://schemas.openxmlformats.org/wordprocessingml/2006/main" xmlns:w14="http://schemas.microsoft.com/office/word/2010/wordml" xmlns:w15="http://schemas.microsoft.com/office/word/2012/wordml" xmlns:w16cex="http://schemas.microsoft.com/office/word/2018/wordml/cex" xmlns:w16cid="http://schemas.microsoft.com/office/word/2016/wordml/cid" xmlns:w16="http://schemas.microsoft.com/office/word/2018/wordml" xmlns:w16sdtdh="http://schemas.microsoft.com/office/word/2020/wordml/sdtdatahash" xmlns:w16se="http://schemas.microsoft.com/office/word/2015/wordml/symex" xmlns:wpg="http://schemas.microsoft.com/office/word/2010/wordprocessingGroup" xmlns:wpi="http://schemas.microsoft.com/office/word/2010/wordprocessingInk" xmlns:wne="http://schemas.microsoft.com/office/word/2006/wordml" xmlns:wps="http://schemas.microsoft.com/office/word/2010/wordprocessingShape" mc:Ignorable="w14 w15 w16se w16cid w16 w16cex w16sdtdh wp14">
+<w:endnotes xmlns:wpc="http://schemas.microsoft.com/office/word/2010/wordprocessingCanvas" xmlns:cx="http://schemas.microsoft.com/office/drawing/2014/chartex" xmlns:cx1="http://schemas.microsoft.com/office/drawing/2015/9/8/chartex" xmlns:cx2="http://schemas.microsoft.com/office/drawing/2015/10/21/chartex" xmlns:cx3="http://schemas.microsoft.com/office/drawing/2016/5/9/chartex" xmlns:cx4="http://schemas.microsoft.com/office/drawing/2016/5/10/chartex" xmlns:cx5="http://schemas.microsoft.com/office/drawing/2016/5/11/chartex" xmlns:cx6="http://schemas.microsoft.com/office/drawing/2016/5/12/chartex" xmlns:cx7="http://schemas.microsoft.com/office/drawing/2016/5/13/chartex" xmlns:cx8="http://schemas.microsoft.com/office/drawing/2016/5/14/chartex" xmlns:mc="http://schemas.openxmlformats.org/markup-compatibility/2006" xmlns:aink="http://schemas.microsoft.com/office/drawing/2016/ink" xmlns:am3d="http://schemas.microsoft.com/office/drawing/2017/model3d" xmlns:o="urn:schemas-microsoft-com:office:office" xmlns:oel="http://schemas.microsoft.com/office/2019/extlst" xmlns:r="http://schemas.openxmlformats.org/officeDocument/2006/relationships" xmlns:m="http://schemas.openxmlformats.org/officeDocument/2006/math" xmlns:v="urn:schemas-microsoft-com:vml" xmlns:wp14="http://schemas.microsoft.com/office/word/2010/wordprocessingDrawing" xmlns:wp="http://schemas.openxmlformats.org/drawingml/2006/wordprocessingDrawing" xmlns:w10="urn:schemas-microsoft-com:office:word" xmlns:w="http://schemas.openxmlformats.org/wordprocessingml/2006/main" xmlns:w14="http://schemas.microsoft.com/office/word/2010/wordml" xmlns:w15="http://schemas.microsoft.com/office/word/2012/wordml" xmlns:w16cex="http://schemas.microsoft.com/office/word/2018/wordml/cex" xmlns:w16cid="http://schemas.microsoft.com/office/word/2016/wordml/cid" xmlns:w16="http://schemas.microsoft.com/office/word/2018/wordml" xmlns:w16du="http://schemas.microsoft.com/office/word/2023/wordml/word16du" xmlns:w16sdtdh="http://schemas.microsoft.com/office/word/2020/wordml/sdtdatahash" xmlns:w16sdtfl="http://schemas.microsoft.com/office/word/2024/wordml/sdtformatlock" xmlns:w16se="http://schemas.microsoft.com/office/word/2015/wordml/symex" xmlns:wpg="http://schemas.microsoft.com/office/word/2010/wordprocessingGroup" xmlns:wpi="http://schemas.microsoft.com/office/word/2010/wordprocessingInk" xmlns:wne="http://schemas.microsoft.com/office/word/2006/wordml" xmlns:wps="http://schemas.microsoft.com/office/word/2010/wordprocessingShape" mc:Ignorable="w14 w15 w16se w16cid w16 w16cex w16sdtdh w16sdtfl w16du wp14">
   <w:endnote w:type="separator" w:id="-1">
     <w:p>
       <w:r>
@@ -3366,7 +3439,7 @@
 </file>
 
 <file path=word/footer1.xml><?xml version="1.0" encoding="utf-8"?>
-<w:ftr xmlns:wpc="http://schemas.microsoft.com/office/word/2010/wordprocessingCanvas" xmlns:cx="http://schemas.microsoft.com/office/drawing/2014/chartex" xmlns:cx1="http://schemas.microsoft.com/office/drawing/2015/9/8/chartex" xmlns:cx2="http://schemas.microsoft.com/office/drawing/2015/10/21/chartex" xmlns:cx3="http://schemas.microsoft.com/office/drawing/2016/5/9/chartex" xmlns:cx4="http://schemas.microsoft.com/office/drawing/2016/5/10/chartex" xmlns:cx5="http://schemas.microsoft.com/office/drawing/2016/5/11/chartex" xmlns:cx6="http://schemas.microsoft.com/office/drawing/2016/5/12/chartex" xmlns:cx7="http://schemas.microsoft.com/office/drawing/2016/5/13/chartex" xmlns:cx8="http://schemas.microsoft.com/office/drawing/2016/5/14/chartex" xmlns:mc="http://schemas.openxmlformats.org/markup-compatibility/2006" xmlns:aink="http://schemas.microsoft.com/office/drawing/2016/ink" xmlns:am3d="http://schemas.microsoft.com/office/drawing/2017/model3d" xmlns:o="urn:schemas-microsoft-com:office:office" xmlns:oel="http://schemas.microsoft.com/office/2019/extlst" xmlns:r="http://schemas.openxmlformats.org/officeDocument/2006/relationships" xmlns:m="http://schemas.openxmlformats.org/officeDocument/2006/math" xmlns:v="urn:schemas-microsoft-com:vml" xmlns:wp14="http://schemas.microsoft.com/office/word/2010/wordprocessingDrawing" xmlns:wp="http://schemas.openxmlformats.org/drawingml/2006/wordprocessingDrawing" xmlns:w10="urn:schemas-microsoft-com:office:word" xmlns:w="http://schemas.openxmlformats.org/wordprocessingml/2006/main" xmlns:w14="http://schemas.microsoft.com/office/word/2010/wordml" xmlns:w15="http://schemas.microsoft.com/office/word/2012/wordml" xmlns:w16cex="http://schemas.microsoft.com/office/word/2018/wordml/cex" xmlns:w16cid="http://schemas.microsoft.com/office/word/2016/wordml/cid" xmlns:w16="http://schemas.microsoft.com/office/word/2018/wordml" xmlns:w16sdtdh="http://schemas.microsoft.com/office/word/2020/wordml/sdtdatahash" xmlns:w16se="http://schemas.microsoft.com/office/word/2015/wordml/symex" xmlns:wpg="http://schemas.microsoft.com/office/word/2010/wordprocessingGroup" xmlns:wpi="http://schemas.microsoft.com/office/word/2010/wordprocessingInk" xmlns:wne="http://schemas.microsoft.com/office/word/2006/wordml" xmlns:wps="http://schemas.microsoft.com/office/word/2010/wordprocessingShape" mc:Ignorable="w14 w15 w16se w16cid w16 w16cex w16sdtdh wp14">
+<w:ftr xmlns:wpc="http://schemas.microsoft.com/office/word/2010/wordprocessingCanvas" xmlns:cx="http://schemas.microsoft.com/office/drawing/2014/chartex" xmlns:cx1="http://schemas.microsoft.com/office/drawing/2015/9/8/chartex" xmlns:cx2="http://schemas.microsoft.com/office/drawing/2015/10/21/chartex" xmlns:cx3="http://schemas.microsoft.com/office/drawing/2016/5/9/chartex" xmlns:cx4="http://schemas.microsoft.com/office/drawing/2016/5/10/chartex" xmlns:cx5="http://schemas.microsoft.com/office/drawing/2016/5/11/chartex" xmlns:cx6="http://schemas.microsoft.com/office/drawing/2016/5/12/chartex" xmlns:cx7="http://schemas.microsoft.com/office/drawing/2016/5/13/chartex" xmlns:cx8="http://schemas.microsoft.com/office/drawing/2016/5/14/chartex" xmlns:mc="http://schemas.openxmlformats.org/markup-compatibility/2006" xmlns:aink="http://schemas.microsoft.com/office/drawing/2016/ink" xmlns:am3d="http://schemas.microsoft.com/office/drawing/2017/model3d" xmlns:o="urn:schemas-microsoft-com:office:office" xmlns:oel="http://schemas.microsoft.com/office/2019/extlst" xmlns:r="http://schemas.openxmlformats.org/officeDocument/2006/relationships" xmlns:m="http://schemas.openxmlformats.org/officeDocument/2006/math" xmlns:v="urn:schemas-microsoft-com:vml" xmlns:wp14="http://schemas.microsoft.com/office/word/2010/wordprocessingDrawing" xmlns:wp="http://schemas.openxmlformats.org/drawingml/2006/wordprocessingDrawing" xmlns:w10="urn:schemas-microsoft-com:office:word" xmlns:w="http://schemas.openxmlformats.org/wordprocessingml/2006/main" xmlns:w14="http://schemas.microsoft.com/office/word/2010/wordml" xmlns:w15="http://schemas.microsoft.com/office/word/2012/wordml" xmlns:w16cex="http://schemas.microsoft.com/office/word/2018/wordml/cex" xmlns:w16cid="http://schemas.microsoft.com/office/word/2016/wordml/cid" xmlns:w16="http://schemas.microsoft.com/office/word/2018/wordml" xmlns:w16du="http://schemas.microsoft.com/office/word/2023/wordml/word16du" xmlns:w16sdtdh="http://schemas.microsoft.com/office/word/2020/wordml/sdtdatahash" xmlns:w16sdtfl="http://schemas.microsoft.com/office/word/2024/wordml/sdtformatlock" xmlns:w16se="http://schemas.microsoft.com/office/word/2015/wordml/symex" xmlns:wpg="http://schemas.microsoft.com/office/word/2010/wordprocessingGroup" xmlns:wpi="http://schemas.microsoft.com/office/word/2010/wordprocessingInk" xmlns:wne="http://schemas.microsoft.com/office/word/2006/wordml" xmlns:wps="http://schemas.microsoft.com/office/word/2010/wordprocessingShape" mc:Ignorable="w14 w15 w16se w16cid w16 w16cex w16sdtdh w16sdtfl w16du wp14">
   <w:p>
     <w:pPr>
       <w:pStyle w:val="smile-footer"/>
@@ -3574,7 +3647,7 @@
 </file>
 
 <file path=word/footnotes.xml><?xml version="1.0" encoding="utf-8"?>
-<w:footnotes xmlns:wpc="http://schemas.microsoft.com/office/word/2010/wordprocessingCanvas" xmlns:cx="http://schemas.microsoft.com/office/drawing/2014/chartex" xmlns:cx1="http://schemas.microsoft.com/office/drawing/2015/9/8/chartex" xmlns:cx2="http://schemas.microsoft.com/office/drawing/2015/10/21/chartex" xmlns:cx3="http://schemas.microsoft.com/office/drawing/2016/5/9/chartex" xmlns:cx4="http://schemas.microsoft.com/office/drawing/2016/5/10/chartex" xmlns:cx5="http://schemas.microsoft.com/office/drawing/2016/5/11/chartex" xmlns:cx6="http://schemas.microsoft.com/office/drawing/2016/5/12/chartex" xmlns:cx7="http://schemas.microsoft.com/office/drawing/2016/5/13/chartex" xmlns:cx8="http://schemas.microsoft.com/office/drawing/2016/5/14/chartex" xmlns:mc="http://schemas.openxmlformats.org/markup-compatibility/2006" xmlns:aink="http://schemas.microsoft.com/office/drawing/2016/ink" xmlns:am3d="http://schemas.microsoft.com/office/drawing/2017/model3d" xmlns:o="urn:schemas-microsoft-com:office:office" xmlns:oel="http://schemas.microsoft.com/office/2019/extlst" xmlns:r="http://schemas.openxmlformats.org/officeDocument/2006/relationships" xmlns:m="http://schemas.openxmlformats.org/officeDocument/2006/math" xmlns:v="urn:schemas-microsoft-com:vml" xmlns:wp14="http://schemas.microsoft.com/office/word/2010/wordprocessingDrawing" xmlns:wp="http://schemas.openxmlformats.org/drawingml/2006/wordprocessingDrawing" xmlns:w10="urn:schemas-microsoft-com:office:word" xmlns:w="http://schemas.openxmlformats.org/wordprocessingml/2006/main" xmlns:w14="http://schemas.microsoft.com/office/word/2010/wordml" xmlns:w15="http://schemas.microsoft.com/office/word/2012/wordml" xmlns:w16cex="http://schemas.microsoft.com/office/word/2018/wordml/cex" xmlns:w16cid="http://schemas.microsoft.com/office/word/2016/wordml/cid" xmlns:w16="http://schemas.microsoft.com/office/word/2018/wordml" xmlns:w16sdtdh="http://schemas.microsoft.com/office/word/2020/wordml/sdtdatahash" xmlns:w16se="http://schemas.microsoft.com/office/word/2015/wordml/symex" xmlns:wpg="http://schemas.microsoft.com/office/word/2010/wordprocessingGroup" xmlns:wpi="http://schemas.microsoft.com/office/word/2010/wordprocessingInk" xmlns:wne="http://schemas.microsoft.com/office/word/2006/wordml" xmlns:wps="http://schemas.microsoft.com/office/word/2010/wordprocessingShape" mc:Ignorable="w14 w15 w16se w16cid w16 w16cex w16sdtdh wp14">
+<w:footnotes xmlns:wpc="http://schemas.microsoft.com/office/word/2010/wordprocessingCanvas" xmlns:cx="http://schemas.microsoft.com/office/drawing/2014/chartex" xmlns:cx1="http://schemas.microsoft.com/office/drawing/2015/9/8/chartex" xmlns:cx2="http://schemas.microsoft.com/office/drawing/2015/10/21/chartex" xmlns:cx3="http://schemas.microsoft.com/office/drawing/2016/5/9/chartex" xmlns:cx4="http://schemas.microsoft.com/office/drawing/2016/5/10/chartex" xmlns:cx5="http://schemas.microsoft.com/office/drawing/2016/5/11/chartex" xmlns:cx6="http://schemas.microsoft.com/office/drawing/2016/5/12/chartex" xmlns:cx7="http://schemas.microsoft.com/office/drawing/2016/5/13/chartex" xmlns:cx8="http://schemas.microsoft.com/office/drawing/2016/5/14/chartex" xmlns:mc="http://schemas.openxmlformats.org/markup-compatibility/2006" xmlns:aink="http://schemas.microsoft.com/office/drawing/2016/ink" xmlns:am3d="http://schemas.microsoft.com/office/drawing/2017/model3d" xmlns:o="urn:schemas-microsoft-com:office:office" xmlns:oel="http://schemas.microsoft.com/office/2019/extlst" xmlns:r="http://schemas.openxmlformats.org/officeDocument/2006/relationships" xmlns:m="http://schemas.openxmlformats.org/officeDocument/2006/math" xmlns:v="urn:schemas-microsoft-com:vml" xmlns:wp14="http://schemas.microsoft.com/office/word/2010/wordprocessingDrawing" xmlns:wp="http://schemas.openxmlformats.org/drawingml/2006/wordprocessingDrawing" xmlns:w10="urn:schemas-microsoft-com:office:word" xmlns:w="http://schemas.openxmlformats.org/wordprocessingml/2006/main" xmlns:w14="http://schemas.microsoft.com/office/word/2010/wordml" xmlns:w15="http://schemas.microsoft.com/office/word/2012/wordml" xmlns:w16cex="http://schemas.microsoft.com/office/word/2018/wordml/cex" xmlns:w16cid="http://schemas.microsoft.com/office/word/2016/wordml/cid" xmlns:w16="http://schemas.microsoft.com/office/word/2018/wordml" xmlns:w16du="http://schemas.microsoft.com/office/word/2023/wordml/word16du" xmlns:w16sdtdh="http://schemas.microsoft.com/office/word/2020/wordml/sdtdatahash" xmlns:w16sdtfl="http://schemas.microsoft.com/office/word/2024/wordml/sdtformatlock" xmlns:w16se="http://schemas.microsoft.com/office/word/2015/wordml/symex" xmlns:wpg="http://schemas.microsoft.com/office/word/2010/wordprocessingGroup" xmlns:wpi="http://schemas.microsoft.com/office/word/2010/wordprocessingInk" xmlns:wne="http://schemas.microsoft.com/office/word/2006/wordml" xmlns:wps="http://schemas.microsoft.com/office/word/2010/wordprocessingShape" mc:Ignorable="w14 w15 w16se w16cid w16 w16cex w16sdtdh w16sdtfl w16du wp14">
   <w:footnote w:type="separator" w:id="-1">
     <w:p>
       <w:r>
@@ -3593,7 +3666,7 @@
 </file>
 
 <file path=word/header1.xml><?xml version="1.0" encoding="utf-8"?>
-<w:hdr xmlns:wpc="http://schemas.microsoft.com/office/word/2010/wordprocessingCanvas" xmlns:cx="http://schemas.microsoft.com/office/drawing/2014/chartex" xmlns:cx1="http://schemas.microsoft.com/office/drawing/2015/9/8/chartex" xmlns:cx2="http://schemas.microsoft.com/office/drawing/2015/10/21/chartex" xmlns:cx3="http://schemas.microsoft.com/office/drawing/2016/5/9/chartex" xmlns:cx4="http://schemas.microsoft.com/office/drawing/2016/5/10/chartex" xmlns:cx5="http://schemas.microsoft.com/office/drawing/2016/5/11/chartex" xmlns:cx6="http://schemas.microsoft.com/office/drawing/2016/5/12/chartex" xmlns:cx7="http://schemas.microsoft.com/office/drawing/2016/5/13/chartex" xmlns:cx8="http://schemas.microsoft.com/office/drawing/2016/5/14/chartex" xmlns:mc="http://schemas.openxmlformats.org/markup-compatibility/2006" xmlns:aink="http://schemas.microsoft.com/office/drawing/2016/ink" xmlns:am3d="http://schemas.microsoft.com/office/drawing/2017/model3d" xmlns:o="urn:schemas-microsoft-com:office:office" xmlns:oel="http://schemas.microsoft.com/office/2019/extlst" xmlns:r="http://schemas.openxmlformats.org/officeDocument/2006/relationships" xmlns:m="http://schemas.openxmlformats.org/officeDocument/2006/math" xmlns:v="urn:schemas-microsoft-com:vml" xmlns:wp14="http://schemas.microsoft.com/office/word/2010/wordprocessingDrawing" xmlns:wp="http://schemas.openxmlformats.org/drawingml/2006/wordprocessingDrawing" xmlns:w10="urn:schemas-microsoft-com:office:word" xmlns:w="http://schemas.openxmlformats.org/wordprocessingml/2006/main" xmlns:w14="http://schemas.microsoft.com/office/word/2010/wordml" xmlns:w15="http://schemas.microsoft.com/office/word/2012/wordml" xmlns:w16cex="http://schemas.microsoft.com/office/word/2018/wordml/cex" xmlns:w16cid="http://schemas.microsoft.com/office/word/2016/wordml/cid" xmlns:w16="http://schemas.microsoft.com/office/word/2018/wordml" xmlns:w16sdtdh="http://schemas.microsoft.com/office/word/2020/wordml/sdtdatahash" xmlns:w16se="http://schemas.microsoft.com/office/word/2015/wordml/symex" xmlns:wpg="http://schemas.microsoft.com/office/word/2010/wordprocessingGroup" xmlns:wpi="http://schemas.microsoft.com/office/word/2010/wordprocessingInk" xmlns:wne="http://schemas.microsoft.com/office/word/2006/wordml" xmlns:wps="http://schemas.microsoft.com/office/word/2010/wordprocessingShape" mc:Ignorable="w14 w15 w16se w16cid w16 w16cex w16sdtdh wp14">
+<w:hdr xmlns:wpc="http://schemas.microsoft.com/office/word/2010/wordprocessingCanvas" xmlns:cx="http://schemas.microsoft.com/office/drawing/2014/chartex" xmlns:cx1="http://schemas.microsoft.com/office/drawing/2015/9/8/chartex" xmlns:cx2="http://schemas.microsoft.com/office/drawing/2015/10/21/chartex" xmlns:cx3="http://schemas.microsoft.com/office/drawing/2016/5/9/chartex" xmlns:cx4="http://schemas.microsoft.com/office/drawing/2016/5/10/chartex" xmlns:cx5="http://schemas.microsoft.com/office/drawing/2016/5/11/chartex" xmlns:cx6="http://schemas.microsoft.com/office/drawing/2016/5/12/chartex" xmlns:cx7="http://schemas.microsoft.com/office/drawing/2016/5/13/chartex" xmlns:cx8="http://schemas.microsoft.com/office/drawing/2016/5/14/chartex" xmlns:mc="http://schemas.openxmlformats.org/markup-compatibility/2006" xmlns:aink="http://schemas.microsoft.com/office/drawing/2016/ink" xmlns:am3d="http://schemas.microsoft.com/office/drawing/2017/model3d" xmlns:o="urn:schemas-microsoft-com:office:office" xmlns:oel="http://schemas.microsoft.com/office/2019/extlst" xmlns:r="http://schemas.openxmlformats.org/officeDocument/2006/relationships" xmlns:m="http://schemas.openxmlformats.org/officeDocument/2006/math" xmlns:v="urn:schemas-microsoft-com:vml" xmlns:wp14="http://schemas.microsoft.com/office/word/2010/wordprocessingDrawing" xmlns:wp="http://schemas.openxmlformats.org/drawingml/2006/wordprocessingDrawing" xmlns:w10="urn:schemas-microsoft-com:office:word" xmlns:w="http://schemas.openxmlformats.org/wordprocessingml/2006/main" xmlns:w14="http://schemas.microsoft.com/office/word/2010/wordml" xmlns:w15="http://schemas.microsoft.com/office/word/2012/wordml" xmlns:w16cex="http://schemas.microsoft.com/office/word/2018/wordml/cex" xmlns:w16cid="http://schemas.microsoft.com/office/word/2016/wordml/cid" xmlns:w16="http://schemas.microsoft.com/office/word/2018/wordml" xmlns:w16du="http://schemas.microsoft.com/office/word/2023/wordml/word16du" xmlns:w16sdtdh="http://schemas.microsoft.com/office/word/2020/wordml/sdtdatahash" xmlns:w16sdtfl="http://schemas.microsoft.com/office/word/2024/wordml/sdtformatlock" xmlns:w16se="http://schemas.microsoft.com/office/word/2015/wordml/symex" xmlns:wpg="http://schemas.microsoft.com/office/word/2010/wordprocessingGroup" xmlns:wpi="http://schemas.microsoft.com/office/word/2010/wordprocessingInk" xmlns:wne="http://schemas.microsoft.com/office/word/2006/wordml" xmlns:wps="http://schemas.microsoft.com/office/word/2010/wordprocessingShape" mc:Ignorable="w14 w15 w16se w16cid w16 w16cex w16sdtdh w16sdtfl w16du wp14">
   <w:tbl>
     <w:tblPr>
       <w:tblW w:w="9810" w:type="dxa"/>
@@ -4095,7 +4168,7 @@
 </file>
 
 <file path=word/numbering.xml><?xml version="1.0" encoding="utf-8"?>
-<w:numbering xmlns:wpc="http://schemas.microsoft.com/office/word/2010/wordprocessingCanvas" xmlns:cx="http://schemas.microsoft.com/office/drawing/2014/chartex" xmlns:cx1="http://schemas.microsoft.com/office/drawing/2015/9/8/chartex" xmlns:cx2="http://schemas.microsoft.com/office/drawing/2015/10/21/chartex" xmlns:cx3="http://schemas.microsoft.com/office/drawing/2016/5/9/chartex" xmlns:cx4="http://schemas.microsoft.com/office/drawing/2016/5/10/chartex" xmlns:cx5="http://schemas.microsoft.com/office/drawing/2016/5/11/chartex" xmlns:cx6="http://schemas.microsoft.com/office/drawing/2016/5/12/chartex" xmlns:cx7="http://schemas.microsoft.com/office/drawing/2016/5/13/chartex" xmlns:cx8="http://schemas.microsoft.com/office/drawing/2016/5/14/chartex" xmlns:mc="http://schemas.openxmlformats.org/markup-compatibility/2006" xmlns:aink="http://schemas.microsoft.com/office/drawing/2016/ink" xmlns:am3d="http://schemas.microsoft.com/office/drawing/2017/model3d" xmlns:o="urn:schemas-microsoft-com:office:office" xmlns:oel="http://schemas.microsoft.com/office/2019/extlst" xmlns:r="http://schemas.openxmlformats.org/officeDocument/2006/relationships" xmlns:m="http://schemas.openxmlformats.org/officeDocument/2006/math" xmlns:v="urn:schemas-microsoft-com:vml" xmlns:wp14="http://schemas.microsoft.com/office/word/2010/wordprocessingDrawing" xmlns:wp="http://schemas.openxmlformats.org/drawingml/2006/wordprocessingDrawing" xmlns:w10="urn:schemas-microsoft-com:office:word" xmlns:w="http://schemas.openxmlformats.org/wordprocessingml/2006/main" xmlns:w14="http://schemas.microsoft.com/office/word/2010/wordml" xmlns:w15="http://schemas.microsoft.com/office/word/2012/wordml" xmlns:w16cex="http://schemas.microsoft.com/office/word/2018/wordml/cex" xmlns:w16cid="http://schemas.microsoft.com/office/word/2016/wordml/cid" xmlns:w16="http://schemas.microsoft.com/office/word/2018/wordml" xmlns:w16sdtdh="http://schemas.microsoft.com/office/word/2020/wordml/sdtdatahash" xmlns:w16se="http://schemas.microsoft.com/office/word/2015/wordml/symex" xmlns:wpg="http://schemas.microsoft.com/office/word/2010/wordprocessingGroup" xmlns:wpi="http://schemas.microsoft.com/office/word/2010/wordprocessingInk" xmlns:wne="http://schemas.microsoft.com/office/word/2006/wordml" xmlns:wps="http://schemas.microsoft.com/office/word/2010/wordprocessingShape" mc:Ignorable="w14 w15 w16se w16cid w16 w16cex w16sdtdh wp14">
+<w:numbering xmlns:wpc="http://schemas.microsoft.com/office/word/2010/wordprocessingCanvas" xmlns:cx="http://schemas.microsoft.com/office/drawing/2014/chartex" xmlns:cx1="http://schemas.microsoft.com/office/drawing/2015/9/8/chartex" xmlns:cx2="http://schemas.microsoft.com/office/drawing/2015/10/21/chartex" xmlns:cx3="http://schemas.microsoft.com/office/drawing/2016/5/9/chartex" xmlns:cx4="http://schemas.microsoft.com/office/drawing/2016/5/10/chartex" xmlns:cx5="http://schemas.microsoft.com/office/drawing/2016/5/11/chartex" xmlns:cx6="http://schemas.microsoft.com/office/drawing/2016/5/12/chartex" xmlns:cx7="http://schemas.microsoft.com/office/drawing/2016/5/13/chartex" xmlns:cx8="http://schemas.microsoft.com/office/drawing/2016/5/14/chartex" xmlns:mc="http://schemas.openxmlformats.org/markup-compatibility/2006" xmlns:aink="http://schemas.microsoft.com/office/drawing/2016/ink" xmlns:am3d="http://schemas.microsoft.com/office/drawing/2017/model3d" xmlns:o="urn:schemas-microsoft-com:office:office" xmlns:oel="http://schemas.microsoft.com/office/2019/extlst" xmlns:r="http://schemas.openxmlformats.org/officeDocument/2006/relationships" xmlns:m="http://schemas.openxmlformats.org/officeDocument/2006/math" xmlns:v="urn:schemas-microsoft-com:vml" xmlns:wp14="http://schemas.microsoft.com/office/word/2010/wordprocessingDrawing" xmlns:wp="http://schemas.openxmlformats.org/drawingml/2006/wordprocessingDrawing" xmlns:w10="urn:schemas-microsoft-com:office:word" xmlns:w="http://schemas.openxmlformats.org/wordprocessingml/2006/main" xmlns:w14="http://schemas.microsoft.com/office/word/2010/wordml" xmlns:w15="http://schemas.microsoft.com/office/word/2012/wordml" xmlns:w16cex="http://schemas.microsoft.com/office/word/2018/wordml/cex" xmlns:w16cid="http://schemas.microsoft.com/office/word/2016/wordml/cid" xmlns:w16="http://schemas.microsoft.com/office/word/2018/wordml" xmlns:w16du="http://schemas.microsoft.com/office/word/2023/wordml/word16du" xmlns:w16sdtdh="http://schemas.microsoft.com/office/word/2020/wordml/sdtdatahash" xmlns:w16sdtfl="http://schemas.microsoft.com/office/word/2024/wordml/sdtformatlock" xmlns:w16se="http://schemas.microsoft.com/office/word/2015/wordml/symex" xmlns:wpg="http://schemas.microsoft.com/office/word/2010/wordprocessingGroup" xmlns:wpi="http://schemas.microsoft.com/office/word/2010/wordprocessingInk" xmlns:wne="http://schemas.microsoft.com/office/word/2006/wordml" xmlns:wps="http://schemas.microsoft.com/office/word/2010/wordprocessingShape" mc:Ignorable="w14 w15 w16se w16cid w16 w16cex w16sdtdh w16sdtfl w16du wp14">
   <w:abstractNum w:abstractNumId="0" w15:restartNumberingAfterBreak="0">
     <w:nsid w:val="02F53112"/>
     <w:multiLevelType w:val="multilevel"/>
@@ -5057,7 +5130,7 @@
 </file>
 
 <file path=word/styles.xml><?xml version="1.0" encoding="utf-8"?>
-<w:styles xmlns:mc="http://schemas.openxmlformats.org/markup-compatibility/2006" xmlns:r="http://schemas.openxmlformats.org/officeDocument/2006/relationships" xmlns:w="http://schemas.openxmlformats.org/wordprocessingml/2006/main" xmlns:w14="http://schemas.microsoft.com/office/word/2010/wordml" xmlns:w15="http://schemas.microsoft.com/office/word/2012/wordml" xmlns:w16cex="http://schemas.microsoft.com/office/word/2018/wordml/cex" xmlns:w16cid="http://schemas.microsoft.com/office/word/2016/wordml/cid" xmlns:w16="http://schemas.microsoft.com/office/word/2018/wordml" xmlns:w16sdtdh="http://schemas.microsoft.com/office/word/2020/wordml/sdtdatahash" xmlns:w16se="http://schemas.microsoft.com/office/word/2015/wordml/symex" mc:Ignorable="w14 w15 w16se w16cid w16 w16cex w16sdtdh">
+<w:styles xmlns:mc="http://schemas.openxmlformats.org/markup-compatibility/2006" xmlns:r="http://schemas.openxmlformats.org/officeDocument/2006/relationships" xmlns:w="http://schemas.openxmlformats.org/wordprocessingml/2006/main" xmlns:w14="http://schemas.microsoft.com/office/word/2010/wordml" xmlns:w15="http://schemas.microsoft.com/office/word/2012/wordml" xmlns:w16cex="http://schemas.microsoft.com/office/word/2018/wordml/cex" xmlns:w16cid="http://schemas.microsoft.com/office/word/2016/wordml/cid" xmlns:w16="http://schemas.microsoft.com/office/word/2018/wordml" xmlns:w16du="http://schemas.microsoft.com/office/word/2023/wordml/word16du" xmlns:w16sdtdh="http://schemas.microsoft.com/office/word/2020/wordml/sdtdatahash" xmlns:w16sdtfl="http://schemas.microsoft.com/office/word/2024/wordml/sdtformatlock" xmlns:w16se="http://schemas.microsoft.com/office/word/2015/wordml/symex" mc:Ignorable="w14 w15 w16se w16cid w16 w16cex w16sdtdh w16sdtfl w16du">
   <w:docDefaults>
     <w:rPrDefault>
       <w:rPr>
@@ -5179,6 +5252,7 @@
     <w:lsdException w:name="HTML Sample" w:semiHidden="1" w:unhideWhenUsed="1"/>
     <w:lsdException w:name="HTML Typewriter" w:semiHidden="1" w:unhideWhenUsed="1"/>
     <w:lsdException w:name="HTML Variable" w:semiHidden="1" w:unhideWhenUsed="1"/>
+    <w:lsdException w:name="Normal Table" w:semiHidden="1" w:unhideWhenUsed="1"/>
     <w:lsdException w:name="annotation subject" w:semiHidden="1" w:unhideWhenUsed="1"/>
     <w:lsdException w:name="No List" w:semiHidden="1" w:unhideWhenUsed="1"/>
     <w:lsdException w:name="Outline List 1" w:semiHidden="1" w:unhideWhenUsed="1"/>
@@ -5221,8 +5295,11 @@
     <w:lsdException w:name="Table Contemporary" w:semiHidden="1" w:unhideWhenUsed="1"/>
     <w:lsdException w:name="Table Elegant" w:semiHidden="1" w:unhideWhenUsed="1"/>
     <w:lsdException w:name="Table Professional" w:semiHidden="1" w:unhideWhenUsed="1"/>
+    <w:lsdException w:name="Table Subtle 1" w:semiHidden="1" w:unhideWhenUsed="1"/>
     <w:lsdException w:name="Table Subtle 2" w:semiHidden="1" w:unhideWhenUsed="1"/>
     <w:lsdException w:name="Table Web 1" w:semiHidden="1" w:unhideWhenUsed="1"/>
+    <w:lsdException w:name="Table Web 2" w:semiHidden="1" w:unhideWhenUsed="1"/>
+    <w:lsdException w:name="Table Web 3" w:semiHidden="1" w:unhideWhenUsed="1"/>
     <w:lsdException w:name="Balloon Text" w:semiHidden="1" w:unhideWhenUsed="1"/>
     <w:lsdException w:name="Table Grid" w:uiPriority="59"/>
     <w:lsdException w:name="Table Theme" w:semiHidden="1" w:unhideWhenUsed="1"/>

</xml_diff>